<commit_message>
Ajout différents chapitres de 6ème en version json
</commit_message>
<xml_diff>
--- a/Cours/6eme/SaintExupery/Chapitre_8_3/Documents/Chapitre 8 - Partie 3 - Axes de symétrie (A trou).docx
+++ b/Cours/6eme/SaintExupery/Chapitre_8_3/Documents/Chapitre 8 - Partie 3 - Axes de symétrie (A trou).docx
@@ -341,7 +341,25 @@
           <w:szCs w:val="28"/>
           <w:lang w:eastAsia="fr-FR"/>
         </w:rPr>
-        <w:t>Remarque :</w:t>
+        <w:t>Remarque</w:t>
+      </w:r>
+      <w:r>
+        <w:rPr>
+          <w:rStyle w:val="Accentuationlgre"/>
+          <w:sz w:val="28"/>
+          <w:szCs w:val="28"/>
+          <w:lang w:eastAsia="fr-FR"/>
+        </w:rPr>
+        <w:t>s</w:t>
+      </w:r>
+      <w:r>
+        <w:rPr>
+          <w:rStyle w:val="Accentuationlgre"/>
+          <w:sz w:val="28"/>
+          <w:szCs w:val="28"/>
+          <w:lang w:eastAsia="fr-FR"/>
+        </w:rPr>
+        <w:t xml:space="preserve"> :</w:t>
       </w:r>
     </w:p>
     <w:p>
@@ -699,15 +717,7 @@
               <w:t xml:space="preserve">      </w:t>
             </w:r>
             <w:r>
-              <w:t xml:space="preserve"> </w:t>
-            </w:r>
-            <w:proofErr w:type="gramStart"/>
-            <w:r>
-              <w:t>axes</w:t>
-            </w:r>
-            <w:proofErr w:type="gramEnd"/>
-            <w:r>
-              <w:t xml:space="preserve"> de symétrie.</w:t>
+              <w:t xml:space="preserve"> axes de symétrie.</w:t>
             </w:r>
           </w:p>
         </w:tc>
@@ -745,15 +755,7 @@
               <w:t xml:space="preserve">      </w:t>
             </w:r>
             <w:r>
-              <w:t xml:space="preserve"> </w:t>
-            </w:r>
-            <w:proofErr w:type="gramStart"/>
-            <w:r>
-              <w:t>axes</w:t>
-            </w:r>
-            <w:proofErr w:type="gramEnd"/>
-            <w:r>
-              <w:t xml:space="preserve"> de symétrie.</w:t>
+              <w:t xml:space="preserve"> axes de symétrie.</w:t>
             </w:r>
           </w:p>
         </w:tc>
@@ -791,15 +793,7 @@
               <w:t xml:space="preserve">       </w:t>
             </w:r>
             <w:r>
-              <w:t xml:space="preserve"> </w:t>
-            </w:r>
-            <w:proofErr w:type="gramStart"/>
-            <w:r>
-              <w:t>axes</w:t>
-            </w:r>
-            <w:proofErr w:type="gramEnd"/>
-            <w:r>
-              <w:t xml:space="preserve"> de symétrie.</w:t>
+              <w:t xml:space="preserve"> axes de symétrie.</w:t>
             </w:r>
           </w:p>
         </w:tc>
@@ -1106,7 +1100,13 @@
               <w:t>cercle</w:t>
             </w:r>
             <w:r>
-              <w:t xml:space="preserve"> a une infinité axes de symétrie.</w:t>
+              <w:t xml:space="preserve"> a une infinité </w:t>
+            </w:r>
+            <w:r>
+              <w:t>d’</w:t>
+            </w:r>
+            <w:r>
+              <w:t>axes de symétrie.</w:t>
             </w:r>
           </w:p>
         </w:tc>

</xml_diff>